<commit_message>
Banco de perguntas do PS: abertura enxuta antes do Bloco 1
</commit_message>
<xml_diff>
--- a/processo-seletivo/Banco de perguntas - Processo Seletivo.docx
+++ b/processo-seletivo/Banco de perguntas - Processo Seletivo.docx
@@ -40,156 +40,7 @@
           <w:color w:val="1E293B"/>
           <w:sz w:val="19"/>
         </w:rPr>
-        <w:t>Este banco existe para que duas pessoas entrevistando candidatos diferentes cheguem a notas comparáveis. Cada pergunta vem com o contexto para ler em voz alta, a pergunta em si e a régua de 0 a 5 com o que caracteriza cada nota. O entrevistador não precisa improvisar critério no meio da conversa.</w:t>
-      </w:r>
-    </w:p>
-    <w:p>
-      <w:pPr>
-        <w:keepNext/>
-        <w:spacing w:before="200" w:after="60"/>
-        <w:pBdr>
-          <w:bottom w:val="single" w:sz="6" w:color="C1272D"/>
-        </w:pBdr>
-      </w:pPr>
-      <w:r>
-        <w:rPr>
-          <w:b/>
-          <w:color w:val="C1272D"/>
-          <w:sz w:val="24"/>
-        </w:rPr>
-        <w:t>Como usar na entrevista</w:t>
-      </w:r>
-    </w:p>
-    <w:p>
-      <w:pPr>
-        <w:pStyle w:val="ListBullet"/>
-        <w:spacing w:after="20"/>
-        <w:ind w:left="312"/>
-      </w:pPr>
-      <w:r>
-        <w:rPr>
-          <w:b/>
-          <w:color w:val="1E293B"/>
-          <w:sz w:val="19"/>
-        </w:rPr>
-        <w:t xml:space="preserve">Quantas por candidato: </w:t>
-      </w:r>
-      <w:r>
-        <w:rPr>
-          <w:color w:val="1E293B"/>
-          <w:sz w:val="19"/>
-        </w:rPr>
-        <w:t>quatro no total, sendo uma de business sense, uma de guesstimate e duas de sondagem. Dá cerca de 25 minutos e cobre raciocínio estruturado, conta de cabeça e perfil.</w:t>
-      </w:r>
-    </w:p>
-    <w:p>
-      <w:pPr>
-        <w:pStyle w:val="ListBullet"/>
-        <w:spacing w:after="20"/>
-        <w:ind w:left="312"/>
-      </w:pPr>
-      <w:r>
-        <w:rPr>
-          <w:b/>
-          <w:color w:val="1E293B"/>
-          <w:sz w:val="19"/>
-        </w:rPr>
-        <w:t xml:space="preserve">Como escalonar: </w:t>
-      </w:r>
-      <w:r>
-        <w:rPr>
-          <w:color w:val="1E293B"/>
-          <w:sz w:val="19"/>
-        </w:rPr>
-        <w:t>comece pelo nível fácil e só suba se o candidato resolver com folga. Nível difícil em candidato travado não mede nada, só desanima.</w:t>
-      </w:r>
-    </w:p>
-    <w:p>
-      <w:pPr>
-        <w:pStyle w:val="ListBullet"/>
-        <w:spacing w:after="20"/>
-        <w:ind w:left="312"/>
-      </w:pPr>
-      <w:r>
-        <w:rPr>
-          <w:b/>
-          <w:color w:val="1E293B"/>
-          <w:sz w:val="19"/>
-        </w:rPr>
-        <w:t xml:space="preserve">A regra do silêncio: </w:t>
-      </w:r>
-      <w:r>
-        <w:rPr>
-          <w:color w:val="1E293B"/>
-          <w:sz w:val="19"/>
-        </w:rPr>
-        <w:t>depois de fazer a pergunta, deixe pelo menos um minuto de silêncio antes de dar qualquer dica. A primeira reação do candidato ao não saber por onde começar é metade da avaliação.</w:t>
-      </w:r>
-    </w:p>
-    <w:p>
-      <w:pPr>
-        <w:pStyle w:val="ListBullet"/>
-        <w:spacing w:after="20"/>
-        <w:ind w:left="312"/>
-      </w:pPr>
-      <w:r>
-        <w:rPr>
-          <w:b/>
-          <w:color w:val="1E293B"/>
-          <w:sz w:val="19"/>
-        </w:rPr>
-        <w:t xml:space="preserve">Material: </w:t>
-      </w:r>
-      <w:r>
-        <w:rPr>
-          <w:color w:val="1E293B"/>
-          <w:sz w:val="19"/>
-        </w:rPr>
-        <w:t>papel e caneta sempre. Em guesstimate, peça para escrever a conta. Se a conta não estiver visível, a nota máxima é 3.</w:t>
-      </w:r>
-    </w:p>
-    <w:p>
-      <w:pPr>
-        <w:pStyle w:val="ListBullet"/>
-        <w:spacing w:after="20"/>
-        <w:ind w:left="312"/>
-      </w:pPr>
-      <w:r>
-        <w:rPr>
-          <w:b/>
-          <w:color w:val="1E293B"/>
-          <w:sz w:val="19"/>
-        </w:rPr>
-        <w:t xml:space="preserve">Registro obrigatório: </w:t>
-      </w:r>
-      <w:r>
-        <w:rPr>
-          <w:color w:val="1E293B"/>
-          <w:sz w:val="19"/>
-        </w:rPr>
-        <w:t>anote a frase que justificou a nota, não só o número. É o que permite defender a nota na calibração e dar retorno ao candidato depois.</w:t>
-      </w:r>
-    </w:p>
-    <w:p>
-      <w:pPr>
-        <w:pStyle w:val="ListBullet"/>
-        <w:spacing w:after="20"/>
-        <w:ind w:left="312"/>
-      </w:pPr>
-      <w:r>
-        <w:rPr>
-          <w:b/>
-          <w:color w:val="1E293B"/>
-          <w:sz w:val="19"/>
-        </w:rPr>
-        <w:t xml:space="preserve">Se pedirem dados: </w:t>
-      </w:r>
-      <w:r>
-        <w:rPr>
-          <w:color w:val="1E293B"/>
-          <w:sz w:val="19"/>
-        </w:rPr>
-        <w:t>se o candidato pedir dado que você não tem, responda que ele pode assumir e seguir, desde que declare a premissa. Isso é parte do teste.</w:t>
+        <w:t>Este banco reúne as perguntas da etapa de entrevista, em três blocos: business sense, guesstimate e sondagem. Cada pergunta traz o contexto para ler em voz alta e, nos dois primeiros blocos, a régua de 0 a 5 com o que caracteriza cada nota.</w:t>
       </w:r>
     </w:p>
     <w:p>

</xml_diff>

<commit_message>
Mantem as tres regras de conducao na abertura do banco do PS
</commit_message>
<xml_diff>
--- a/processo-seletivo/Banco de perguntas - Processo Seletivo.docx
+++ b/processo-seletivo/Banco de perguntas - Processo Seletivo.docx
@@ -41,6 +41,72 @@
           <w:sz w:val="19"/>
         </w:rPr>
         <w:t>Este banco reúne as perguntas da etapa de entrevista, em três blocos: business sense, guesstimate e sondagem. Cada pergunta traz o contexto para ler em voz alta e, nos dois primeiros blocos, a régua de 0 a 5 com o que caracteriza cada nota.</w:t>
+      </w:r>
+    </w:p>
+    <w:p>
+      <w:pPr>
+        <w:pStyle w:val="ListBullet"/>
+        <w:spacing w:after="20"/>
+        <w:ind w:left="312"/>
+      </w:pPr>
+      <w:r>
+        <w:rPr>
+          <w:b/>
+          <w:color w:val="1E293B"/>
+          <w:sz w:val="19"/>
+        </w:rPr>
+        <w:t xml:space="preserve">A regra do silêncio: </w:t>
+      </w:r>
+      <w:r>
+        <w:rPr>
+          <w:color w:val="1E293B"/>
+          <w:sz w:val="19"/>
+        </w:rPr>
+        <w:t>depois de fazer a pergunta, deixe pelo menos um minuto de silêncio antes de dar qualquer dica. A primeira reação do candidato ao não saber por onde começar é metade da avaliação.</w:t>
+      </w:r>
+    </w:p>
+    <w:p>
+      <w:pPr>
+        <w:pStyle w:val="ListBullet"/>
+        <w:spacing w:after="20"/>
+        <w:ind w:left="312"/>
+      </w:pPr>
+      <w:r>
+        <w:rPr>
+          <w:b/>
+          <w:color w:val="1E293B"/>
+          <w:sz w:val="19"/>
+        </w:rPr>
+        <w:t xml:space="preserve">Material: </w:t>
+      </w:r>
+      <w:r>
+        <w:rPr>
+          <w:color w:val="1E293B"/>
+          <w:sz w:val="19"/>
+        </w:rPr>
+        <w:t>papel e caneta sempre. Em guesstimate, peça para escrever a conta. Se a conta não estiver visível, a nota máxima é 3.</w:t>
+      </w:r>
+    </w:p>
+    <w:p>
+      <w:pPr>
+        <w:pStyle w:val="ListBullet"/>
+        <w:spacing w:after="20"/>
+        <w:ind w:left="312"/>
+      </w:pPr>
+      <w:r>
+        <w:rPr>
+          <w:b/>
+          <w:color w:val="1E293B"/>
+          <w:sz w:val="19"/>
+        </w:rPr>
+        <w:t xml:space="preserve">Se pedirem dados: </w:t>
+      </w:r>
+      <w:r>
+        <w:rPr>
+          <w:color w:val="1E293B"/>
+          <w:sz w:val="19"/>
+        </w:rPr>
+        <w:t>se o candidato pedir dado que você não tem, responda que ele pode assumir e seguir, desde que declare a premissa. Isso é parte do teste.</w:t>
       </w:r>
     </w:p>
     <w:p>

</xml_diff>